<commit_message>
Push final : notebook WOE, figures, frontend, docs mis a jour
</commit_message>
<xml_diff>
--- a/docs/Guide_Complet_PD_Model.docx
+++ b/docs/Guide_Complet_PD_Model.docx
@@ -117,12 +117,6 @@
         <w:gridCol w:w="2891"/>
       </w:tblGrid>
       <w:tr>
-        <w:tblPrEx>
-          <w:tblCellMar>
-            <w:top w:w="0" w:type="dxa"/>
-            <w:bottom w:w="0" w:type="dxa"/>
-          </w:tblCellMar>
-        </w:tblPrEx>
         <w:tc>
           <w:tcPr>
             <w:tcW w:w="2891" w:type="dxa"/>
@@ -183,12 +177,6 @@
         </w:tc>
       </w:tr>
       <w:tr>
-        <w:tblPrEx>
-          <w:tblCellMar>
-            <w:top w:w="0" w:type="dxa"/>
-            <w:bottom w:w="0" w:type="dxa"/>
-          </w:tblCellMar>
-        </w:tblPrEx>
         <w:tc>
           <w:tcPr>
             <w:tcW w:w="2891" w:type="dxa"/>
@@ -251,12 +239,6 @@
         </w:tc>
       </w:tr>
       <w:tr>
-        <w:tblPrEx>
-          <w:tblCellMar>
-            <w:top w:w="0" w:type="dxa"/>
-            <w:bottom w:w="0" w:type="dxa"/>
-          </w:tblCellMar>
-        </w:tblPrEx>
         <w:tc>
           <w:tcPr>
             <w:tcW w:w="2891" w:type="dxa"/>
@@ -2614,12 +2596,6 @@
         <w:gridCol w:w="8353"/>
       </w:tblGrid>
       <w:tr>
-        <w:tblPrEx>
-          <w:tblCellMar>
-            <w:top w:w="0" w:type="dxa"/>
-            <w:bottom w:w="0" w:type="dxa"/>
-          </w:tblCellMar>
-        </w:tblPrEx>
         <w:tc>
           <w:tcPr>
             <w:tcW w:w="900" w:type="dxa"/>
@@ -2913,12 +2889,6 @@
         <w:gridCol w:w="4819"/>
       </w:tblGrid>
       <w:tr>
-        <w:tblPrEx>
-          <w:tblCellMar>
-            <w:top w:w="0" w:type="dxa"/>
-            <w:bottom w:w="0" w:type="dxa"/>
-          </w:tblCellMar>
-        </w:tblPrEx>
         <w:tc>
           <w:tcPr>
             <w:tcW w:w="4819" w:type="dxa"/>
@@ -3001,12 +2971,6 @@
         </w:tc>
       </w:tr>
       <w:tr>
-        <w:tblPrEx>
-          <w:tblCellMar>
-            <w:top w:w="0" w:type="dxa"/>
-            <w:bottom w:w="0" w:type="dxa"/>
-          </w:tblCellMar>
-        </w:tblPrEx>
         <w:tc>
           <w:tcPr>
             <w:tcW w:w="4819" w:type="dxa"/>
@@ -3095,12 +3059,6 @@
         </w:tc>
       </w:tr>
       <w:tr>
-        <w:tblPrEx>
-          <w:tblCellMar>
-            <w:top w:w="0" w:type="dxa"/>
-            <w:bottom w:w="0" w:type="dxa"/>
-          </w:tblCellMar>
-        </w:tblPrEx>
         <w:tc>
           <w:tcPr>
             <w:tcW w:w="4819" w:type="dxa"/>
@@ -3197,12 +3155,6 @@
         </w:tc>
       </w:tr>
       <w:tr>
-        <w:tblPrEx>
-          <w:tblCellMar>
-            <w:top w:w="0" w:type="dxa"/>
-            <w:bottom w:w="0" w:type="dxa"/>
-          </w:tblCellMar>
-        </w:tblPrEx>
         <w:tc>
           <w:tcPr>
             <w:tcW w:w="4819" w:type="dxa"/>
@@ -3337,12 +3289,6 @@
         </w:tc>
       </w:tr>
       <w:tr>
-        <w:tblPrEx>
-          <w:tblCellMar>
-            <w:top w:w="0" w:type="dxa"/>
-            <w:bottom w:w="0" w:type="dxa"/>
-          </w:tblCellMar>
-        </w:tblPrEx>
         <w:tc>
           <w:tcPr>
             <w:tcW w:w="4819" w:type="dxa"/>
@@ -3727,12 +3673,6 @@
         <w:gridCol w:w="8331"/>
       </w:tblGrid>
       <w:tr>
-        <w:tblPrEx>
-          <w:tblCellMar>
-            <w:top w:w="0" w:type="dxa"/>
-            <w:bottom w:w="0" w:type="dxa"/>
-          </w:tblCellMar>
-        </w:tblPrEx>
         <w:tc>
           <w:tcPr>
             <w:tcW w:w="900" w:type="dxa"/>
@@ -3969,12 +3909,6 @@
         <w:gridCol w:w="3180"/>
       </w:tblGrid>
       <w:tr>
-        <w:tblPrEx>
-          <w:tblCellMar>
-            <w:top w:w="0" w:type="dxa"/>
-            <w:bottom w:w="0" w:type="dxa"/>
-          </w:tblCellMar>
-        </w:tblPrEx>
         <w:tc>
           <w:tcPr>
             <w:tcW w:w="2891" w:type="dxa"/>
@@ -4083,12 +4017,6 @@
         </w:tc>
       </w:tr>
       <w:tr>
-        <w:tblPrEx>
-          <w:tblCellMar>
-            <w:top w:w="0" w:type="dxa"/>
-            <w:bottom w:w="0" w:type="dxa"/>
-          </w:tblCellMar>
-        </w:tblPrEx>
         <w:tc>
           <w:tcPr>
             <w:tcW w:w="4819" w:type="dxa"/>
@@ -4188,12 +4116,6 @@
         </w:tc>
       </w:tr>
       <w:tr>
-        <w:tblPrEx>
-          <w:tblCellMar>
-            <w:top w:w="0" w:type="dxa"/>
-            <w:bottom w:w="0" w:type="dxa"/>
-          </w:tblCellMar>
-        </w:tblPrEx>
         <w:tc>
           <w:tcPr>
             <w:tcW w:w="4819" w:type="dxa"/>
@@ -4321,12 +4243,6 @@
         </w:tc>
       </w:tr>
       <w:tr>
-        <w:tblPrEx>
-          <w:tblCellMar>
-            <w:top w:w="0" w:type="dxa"/>
-            <w:bottom w:w="0" w:type="dxa"/>
-          </w:tblCellMar>
-        </w:tblPrEx>
         <w:tc>
           <w:tcPr>
             <w:tcW w:w="4819" w:type="dxa"/>
@@ -4454,12 +4370,6 @@
         </w:tc>
       </w:tr>
       <w:tr>
-        <w:tblPrEx>
-          <w:tblCellMar>
-            <w:top w:w="0" w:type="dxa"/>
-            <w:bottom w:w="0" w:type="dxa"/>
-          </w:tblCellMar>
-        </w:tblPrEx>
         <w:tc>
           <w:tcPr>
             <w:tcW w:w="4819" w:type="dxa"/>
@@ -4579,12 +4489,6 @@
         </w:tc>
       </w:tr>
       <w:tr>
-        <w:tblPrEx>
-          <w:tblCellMar>
-            <w:top w:w="0" w:type="dxa"/>
-            <w:bottom w:w="0" w:type="dxa"/>
-          </w:tblCellMar>
-        </w:tblPrEx>
         <w:tc>
           <w:tcPr>
             <w:tcW w:w="4819" w:type="dxa"/>
@@ -4752,12 +4656,6 @@
         <w:gridCol w:w="2277"/>
       </w:tblGrid>
       <w:tr>
-        <w:tblPrEx>
-          <w:tblCellMar>
-            <w:top w:w="0" w:type="dxa"/>
-            <w:bottom w:w="0" w:type="dxa"/>
-          </w:tblCellMar>
-        </w:tblPrEx>
         <w:tc>
           <w:tcPr>
             <w:tcW w:w="2698" w:type="dxa"/>
@@ -4896,12 +4794,6 @@
         </w:tc>
       </w:tr>
       <w:tr>
-        <w:tblPrEx>
-          <w:tblCellMar>
-            <w:top w:w="0" w:type="dxa"/>
-            <w:bottom w:w="0" w:type="dxa"/>
-          </w:tblCellMar>
-        </w:tblPrEx>
         <w:tc>
           <w:tcPr>
             <w:tcW w:w="4819" w:type="dxa"/>
@@ -5070,12 +4962,6 @@
         </w:tc>
       </w:tr>
       <w:tr>
-        <w:tblPrEx>
-          <w:tblCellMar>
-            <w:top w:w="0" w:type="dxa"/>
-            <w:bottom w:w="0" w:type="dxa"/>
-          </w:tblCellMar>
-        </w:tblPrEx>
         <w:tc>
           <w:tcPr>
             <w:tcW w:w="4819" w:type="dxa"/>
@@ -5234,12 +5120,6 @@
         </w:tc>
       </w:tr>
       <w:tr>
-        <w:tblPrEx>
-          <w:tblCellMar>
-            <w:top w:w="0" w:type="dxa"/>
-            <w:bottom w:w="0" w:type="dxa"/>
-          </w:tblCellMar>
-        </w:tblPrEx>
         <w:tc>
           <w:tcPr>
             <w:tcW w:w="4819" w:type="dxa"/>
@@ -5400,12 +5280,6 @@
         </w:tc>
       </w:tr>
       <w:tr>
-        <w:tblPrEx>
-          <w:tblCellMar>
-            <w:top w:w="0" w:type="dxa"/>
-            <w:bottom w:w="0" w:type="dxa"/>
-          </w:tblCellMar>
-        </w:tblPrEx>
         <w:tc>
           <w:tcPr>
             <w:tcW w:w="4819" w:type="dxa"/>
@@ -5584,12 +5458,6 @@
         </w:tc>
       </w:tr>
       <w:tr>
-        <w:tblPrEx>
-          <w:tblCellMar>
-            <w:top w:w="0" w:type="dxa"/>
-            <w:bottom w:w="0" w:type="dxa"/>
-          </w:tblCellMar>
-        </w:tblPrEx>
         <w:tc>
           <w:tcPr>
             <w:tcW w:w="4819" w:type="dxa"/>
@@ -5750,12 +5618,6 @@
         </w:tc>
       </w:tr>
       <w:tr>
-        <w:tblPrEx>
-          <w:tblCellMar>
-            <w:top w:w="0" w:type="dxa"/>
-            <w:bottom w:w="0" w:type="dxa"/>
-          </w:tblCellMar>
-        </w:tblPrEx>
         <w:tc>
           <w:tcPr>
             <w:tcW w:w="4819" w:type="dxa"/>
@@ -5894,12 +5756,6 @@
         </w:tc>
       </w:tr>
       <w:tr>
-        <w:tblPrEx>
-          <w:tblCellMar>
-            <w:top w:w="0" w:type="dxa"/>
-            <w:bottom w:w="0" w:type="dxa"/>
-          </w:tblCellMar>
-        </w:tblPrEx>
         <w:tc>
           <w:tcPr>
             <w:tcW w:w="4819" w:type="dxa"/>
@@ -6076,12 +5932,6 @@
         </w:tc>
       </w:tr>
       <w:tr>
-        <w:tblPrEx>
-          <w:tblCellMar>
-            <w:top w:w="0" w:type="dxa"/>
-            <w:bottom w:w="0" w:type="dxa"/>
-          </w:tblCellMar>
-        </w:tblPrEx>
         <w:tc>
           <w:tcPr>
             <w:tcW w:w="4819" w:type="dxa"/>
@@ -6238,12 +6088,6 @@
         </w:tc>
       </w:tr>
       <w:tr>
-        <w:tblPrEx>
-          <w:tblCellMar>
-            <w:top w:w="0" w:type="dxa"/>
-            <w:bottom w:w="0" w:type="dxa"/>
-          </w:tblCellMar>
-        </w:tblPrEx>
         <w:tc>
           <w:tcPr>
             <w:tcW w:w="4819" w:type="dxa"/>
@@ -6374,12 +6218,6 @@
         </w:tc>
       </w:tr>
       <w:tr>
-        <w:tblPrEx>
-          <w:tblCellMar>
-            <w:top w:w="0" w:type="dxa"/>
-            <w:bottom w:w="0" w:type="dxa"/>
-          </w:tblCellMar>
-        </w:tblPrEx>
         <w:tc>
           <w:tcPr>
             <w:tcW w:w="4819" w:type="dxa"/>
@@ -6995,12 +6833,6 @@
         <w:gridCol w:w="5205"/>
       </w:tblGrid>
       <w:tr>
-        <w:tblPrEx>
-          <w:tblCellMar>
-            <w:top w:w="0" w:type="dxa"/>
-            <w:bottom w:w="0" w:type="dxa"/>
-          </w:tblCellMar>
-        </w:tblPrEx>
         <w:tc>
           <w:tcPr>
             <w:tcW w:w="3855" w:type="dxa"/>
@@ -7095,12 +6927,6 @@
         </w:tc>
       </w:tr>
       <w:tr>
-        <w:tblPrEx>
-          <w:tblCellMar>
-            <w:top w:w="0" w:type="dxa"/>
-            <w:bottom w:w="0" w:type="dxa"/>
-          </w:tblCellMar>
-        </w:tblPrEx>
         <w:tc>
           <w:tcPr>
             <w:tcW w:w="4819" w:type="dxa"/>
@@ -7235,12 +7061,6 @@
         </w:tc>
       </w:tr>
       <w:tr>
-        <w:tblPrEx>
-          <w:tblCellMar>
-            <w:top w:w="0" w:type="dxa"/>
-            <w:bottom w:w="0" w:type="dxa"/>
-          </w:tblCellMar>
-        </w:tblPrEx>
         <w:tc>
           <w:tcPr>
             <w:tcW w:w="4819" w:type="dxa"/>
@@ -7347,12 +7167,6 @@
         </w:tc>
       </w:tr>
       <w:tr>
-        <w:tblPrEx>
-          <w:tblCellMar>
-            <w:top w:w="0" w:type="dxa"/>
-            <w:bottom w:w="0" w:type="dxa"/>
-          </w:tblCellMar>
-        </w:tblPrEx>
         <w:tc>
           <w:tcPr>
             <w:tcW w:w="4819" w:type="dxa"/>
@@ -7431,12 +7245,6 @@
         </w:tc>
       </w:tr>
       <w:tr>
-        <w:tblPrEx>
-          <w:tblCellMar>
-            <w:top w:w="0" w:type="dxa"/>
-            <w:bottom w:w="0" w:type="dxa"/>
-          </w:tblCellMar>
-        </w:tblPrEx>
         <w:tc>
           <w:tcPr>
             <w:tcW w:w="4819" w:type="dxa"/>
@@ -7535,12 +7343,6 @@
         </w:tc>
       </w:tr>
       <w:tr>
-        <w:tblPrEx>
-          <w:tblCellMar>
-            <w:top w:w="0" w:type="dxa"/>
-            <w:bottom w:w="0" w:type="dxa"/>
-          </w:tblCellMar>
-        </w:tblPrEx>
         <w:tc>
           <w:tcPr>
             <w:tcW w:w="4819" w:type="dxa"/>
@@ -7806,12 +7608,6 @@
         <w:gridCol w:w="8342"/>
       </w:tblGrid>
       <w:tr>
-        <w:tblPrEx>
-          <w:tblCellMar>
-            <w:top w:w="0" w:type="dxa"/>
-            <w:bottom w:w="0" w:type="dxa"/>
-          </w:tblCellMar>
-        </w:tblPrEx>
         <w:tc>
           <w:tcPr>
             <w:tcW w:w="900" w:type="dxa"/>
@@ -8070,18 +7866,14 @@
         </w:rPr>
         <w:t xml:space="preserve">. Si quelqu'un gagne 500 000 DT/mois, </w:t>
       </w:r>
-      <w:proofErr w:type="spellStart"/>
-      <w:proofErr w:type="gramStart"/>
       <w:r>
         <w:rPr>
           <w:i/>
           <w:iCs/>
           <w:color w:val="000000"/>
         </w:rPr>
-        <w:t>ca</w:t>
-      </w:r>
-      <w:proofErr w:type="spellEnd"/>
-      <w:proofErr w:type="gramEnd"/>
+        <w:t>ça</w:t>
+      </w:r>
       <w:r>
         <w:rPr>
           <w:i/>
@@ -8121,12 +7913,6 @@
         <w:gridCol w:w="8342"/>
       </w:tblGrid>
       <w:tr>
-        <w:tblPrEx>
-          <w:tblCellMar>
-            <w:top w:w="0" w:type="dxa"/>
-            <w:bottom w:w="0" w:type="dxa"/>
-          </w:tblCellMar>
-        </w:tblPrEx>
         <w:tc>
           <w:tcPr>
             <w:tcW w:w="900" w:type="dxa"/>
@@ -8453,12 +8239,6 @@
         <w:gridCol w:w="8342"/>
       </w:tblGrid>
       <w:tr>
-        <w:tblPrEx>
-          <w:tblCellMar>
-            <w:top w:w="0" w:type="dxa"/>
-            <w:bottom w:w="0" w:type="dxa"/>
-          </w:tblCellMar>
-        </w:tblPrEx>
         <w:tc>
           <w:tcPr>
             <w:tcW w:w="900" w:type="dxa"/>
@@ -8683,51 +8463,78 @@
       <w:pPr>
         <w:spacing w:before="80" w:after="80" w:line="320" w:lineRule="auto"/>
         <w:ind w:left="360"/>
-      </w:pPr>
-      <w:r>
         <w:rPr>
           <w:i/>
           <w:iCs/>
           <w:color w:val="000000"/>
         </w:rPr>
-        <w:t xml:space="preserve">Pourquoi supprimer Permanent ? Pour </w:t>
-      </w:r>
-      <w:proofErr w:type="spellStart"/>
+      </w:pPr>
       <w:r>
         <w:rPr>
           <w:i/>
           <w:iCs/>
           <w:color w:val="000000"/>
         </w:rPr>
-        <w:t>eviter</w:t>
-      </w:r>
-      <w:proofErr w:type="spellEnd"/>
+        <w:t xml:space="preserve">Pourquoi supprimer Permanent ? Pour </w:t>
+      </w:r>
+      <w:proofErr w:type="spellStart"/>
       <w:r>
         <w:rPr>
           <w:i/>
           <w:iCs/>
           <w:color w:val="000000"/>
         </w:rPr>
-        <w:t xml:space="preserve"> la </w:t>
-      </w:r>
-      <w:proofErr w:type="spellStart"/>
+        <w:t>eviter</w:t>
+      </w:r>
+      <w:proofErr w:type="spellEnd"/>
       <w:r>
         <w:rPr>
           <w:i/>
           <w:iCs/>
           <w:color w:val="000000"/>
         </w:rPr>
-        <w:t>multicollinearite</w:t>
-      </w:r>
-      <w:proofErr w:type="spellEnd"/>
+        <w:t xml:space="preserve"> la </w:t>
+      </w:r>
+      <w:proofErr w:type="spellStart"/>
       <w:r>
         <w:rPr>
           <w:i/>
           <w:iCs/>
           <w:color w:val="000000"/>
         </w:rPr>
-        <w:t xml:space="preserve"> (redondance). Si toutes les autres = 0, on sait que c'est Permanent.</w:t>
-      </w:r>
+        <w:t>multicollinearite</w:t>
+      </w:r>
+      <w:proofErr w:type="spellEnd"/>
+      <w:r>
+        <w:rPr>
+          <w:i/>
+          <w:iCs/>
+          <w:color w:val="000000"/>
+        </w:rPr>
+        <w:t xml:space="preserve"> (redondance). Si toutes les autres = 0, on sait que c'est Permanent</w:t>
+      </w:r>
+      <w:r>
+        <w:rPr>
+          <w:i/>
+          <w:iCs/>
+          <w:color w:val="000000"/>
+        </w:rPr>
+        <w:t xml:space="preserve">, autrement dit </w:t>
+      </w:r>
+      <w:r>
+        <w:rPr>
+          <w:i/>
+          <w:iCs/>
+          <w:color w:val="000000"/>
+        </w:rPr>
+        <w:t>le modèle reçoit une information en double. C'est mathématiquement inutile et cela peut perturber certains algorithmes (comme la régression logistique).</w:t>
+      </w:r>
+    </w:p>
+    <w:p>
+      <w:pPr>
+        <w:spacing w:before="80" w:after="80" w:line="320" w:lineRule="auto"/>
+        <w:ind w:left="360"/>
+      </w:pPr>
     </w:p>
     <w:p>
       <w:pPr>
@@ -8767,12 +8574,6 @@
         <w:gridCol w:w="8342"/>
       </w:tblGrid>
       <w:tr>
-        <w:tblPrEx>
-          <w:tblCellMar>
-            <w:top w:w="0" w:type="dxa"/>
-            <w:bottom w:w="0" w:type="dxa"/>
-          </w:tblCellMar>
-        </w:tblPrEx>
         <w:tc>
           <w:tcPr>
             <w:tcW w:w="900" w:type="dxa"/>
@@ -9035,6 +8836,70 @@
         </w:rPr>
         <w:t>).</w:t>
       </w:r>
+      <w:r>
+        <w:rPr>
+          <w:b/>
+          <w:bCs/>
+          <w:color w:val="000000"/>
+        </w:rPr>
+        <w:br/>
+      </w:r>
+      <w:r>
+        <w:rPr>
+          <w:b/>
+          <w:bCs/>
+          <w:color w:val="000000"/>
+        </w:rPr>
+        <w:br/>
+      </w:r>
+      <w:r>
+        <w:t>Les algorithmes sont perturbés par les différences d'échelle.</w:t>
+      </w:r>
+    </w:p>
+    <w:p>
+      <w:pPr>
+        <w:spacing w:before="80" w:after="80" w:line="320" w:lineRule="auto"/>
+        <w:ind w:left="360"/>
+      </w:pPr>
+      <w:r>
+        <w:t xml:space="preserve">Si un client a un revenu de </w:t>
+      </w:r>
+      <w:r>
+        <w:rPr>
+          <w:b/>
+          <w:bCs/>
+        </w:rPr>
+        <w:t>5 000 DT</w:t>
+      </w:r>
+      <w:r>
+        <w:t xml:space="preserve"> et </w:t>
+      </w:r>
+      <w:r>
+        <w:rPr>
+          <w:b/>
+          <w:bCs/>
+        </w:rPr>
+        <w:t>3 jours</w:t>
+      </w:r>
+      <w:r>
+        <w:t xml:space="preserve"> de retard de paiement, le modèle va croire que le revenu est 1 600 fois plus important que le retard, juste parce que le chiffre est plus grand. La standardisation règle ce problème en ramenant toutes les variables autour de </w:t>
+      </w:r>
+      <w:r>
+        <w:rPr>
+          <w:b/>
+          <w:bCs/>
+        </w:rPr>
+        <w:t>0</w:t>
+      </w:r>
+      <w:r>
+        <w:t>.</w:t>
+      </w:r>
+    </w:p>
+    <w:p>
+      <w:pPr>
+        <w:spacing w:before="80" w:after="80" w:line="320" w:lineRule="auto"/>
+        <w:ind w:left="360"/>
+      </w:pPr>
     </w:p>
     <w:p>
       <w:pPr>
@@ -9112,12 +8977,6 @@
         <w:gridCol w:w="8509"/>
       </w:tblGrid>
       <w:tr>
-        <w:tblPrEx>
-          <w:tblCellMar>
-            <w:top w:w="0" w:type="dxa"/>
-            <w:bottom w:w="0" w:type="dxa"/>
-          </w:tblCellMar>
-        </w:tblPrEx>
         <w:tc>
           <w:tcPr>
             <w:tcW w:w="900" w:type="dxa"/>
@@ -9459,12 +9318,6 @@
         <w:gridCol w:w="3231"/>
       </w:tblGrid>
       <w:tr>
-        <w:tblPrEx>
-          <w:tblCellMar>
-            <w:top w:w="0" w:type="dxa"/>
-            <w:bottom w:w="0" w:type="dxa"/>
-          </w:tblCellMar>
-        </w:tblPrEx>
         <w:tc>
           <w:tcPr>
             <w:tcW w:w="3373" w:type="dxa"/>
@@ -9593,12 +9446,6 @@
         </w:tc>
       </w:tr>
       <w:tr>
-        <w:tblPrEx>
-          <w:tblCellMar>
-            <w:top w:w="0" w:type="dxa"/>
-            <w:bottom w:w="0" w:type="dxa"/>
-          </w:tblCellMar>
-        </w:tblPrEx>
         <w:tc>
           <w:tcPr>
             <w:tcW w:w="4819" w:type="dxa"/>
@@ -9690,12 +9537,6 @@
         </w:tc>
       </w:tr>
       <w:tr>
-        <w:tblPrEx>
-          <w:tblCellMar>
-            <w:top w:w="0" w:type="dxa"/>
-            <w:bottom w:w="0" w:type="dxa"/>
-          </w:tblCellMar>
-        </w:tblPrEx>
         <w:tc>
           <w:tcPr>
             <w:tcW w:w="4819" w:type="dxa"/>
@@ -9785,12 +9626,6 @@
         </w:tc>
       </w:tr>
       <w:tr>
-        <w:tblPrEx>
-          <w:tblCellMar>
-            <w:top w:w="0" w:type="dxa"/>
-            <w:bottom w:w="0" w:type="dxa"/>
-          </w:tblCellMar>
-        </w:tblPrEx>
         <w:tc>
           <w:tcPr>
             <w:tcW w:w="4819" w:type="dxa"/>
@@ -9920,12 +9755,6 @@
         </w:tc>
       </w:tr>
       <w:tr>
-        <w:tblPrEx>
-          <w:tblCellMar>
-            <w:top w:w="0" w:type="dxa"/>
-            <w:bottom w:w="0" w:type="dxa"/>
-          </w:tblCellMar>
-        </w:tblPrEx>
         <w:tc>
           <w:tcPr>
             <w:tcW w:w="4819" w:type="dxa"/>
@@ -10043,12 +9872,6 @@
         </w:tc>
       </w:tr>
       <w:tr>
-        <w:tblPrEx>
-          <w:tblCellMar>
-            <w:top w:w="0" w:type="dxa"/>
-            <w:bottom w:w="0" w:type="dxa"/>
-          </w:tblCellMar>
-        </w:tblPrEx>
         <w:tc>
           <w:tcPr>
             <w:tcW w:w="4819" w:type="dxa"/>
@@ -10175,12 +9998,6 @@
         <w:gridCol w:w="8053"/>
       </w:tblGrid>
       <w:tr>
-        <w:tblPrEx>
-          <w:tblCellMar>
-            <w:top w:w="0" w:type="dxa"/>
-            <w:bottom w:w="0" w:type="dxa"/>
-          </w:tblCellMar>
-        </w:tblPrEx>
         <w:tc>
           <w:tcPr>
             <w:tcW w:w="900" w:type="dxa"/>
@@ -10573,12 +10390,6 @@
         <w:gridCol w:w="8442"/>
       </w:tblGrid>
       <w:tr>
-        <w:tblPrEx>
-          <w:tblCellMar>
-            <w:top w:w="0" w:type="dxa"/>
-            <w:bottom w:w="0" w:type="dxa"/>
-          </w:tblCellMar>
-        </w:tblPrEx>
         <w:tc>
           <w:tcPr>
             <w:tcW w:w="900" w:type="dxa"/>
@@ -10854,12 +10665,6 @@
         <w:gridCol w:w="3784"/>
       </w:tblGrid>
       <w:tr>
-        <w:tblPrEx>
-          <w:tblCellMar>
-            <w:top w:w="0" w:type="dxa"/>
-            <w:bottom w:w="0" w:type="dxa"/>
-          </w:tblCellMar>
-        </w:tblPrEx>
         <w:tc>
           <w:tcPr>
             <w:tcW w:w="1927" w:type="dxa"/>
@@ -10966,12 +10771,6 @@
         </w:tc>
       </w:tr>
       <w:tr>
-        <w:tblPrEx>
-          <w:tblCellMar>
-            <w:top w:w="0" w:type="dxa"/>
-            <w:bottom w:w="0" w:type="dxa"/>
-          </w:tblCellMar>
-        </w:tblPrEx>
         <w:tc>
           <w:tcPr>
             <w:tcW w:w="4819" w:type="dxa"/>
@@ -11143,12 +10942,6 @@
         </w:tc>
       </w:tr>
       <w:tr>
-        <w:tblPrEx>
-          <w:tblCellMar>
-            <w:top w:w="0" w:type="dxa"/>
-            <w:bottom w:w="0" w:type="dxa"/>
-          </w:tblCellMar>
-        </w:tblPrEx>
         <w:tc>
           <w:tcPr>
             <w:tcW w:w="4819" w:type="dxa"/>
@@ -11363,12 +11156,6 @@
         </w:tc>
       </w:tr>
       <w:tr>
-        <w:tblPrEx>
-          <w:tblCellMar>
-            <w:top w:w="0" w:type="dxa"/>
-            <w:bottom w:w="0" w:type="dxa"/>
-          </w:tblCellMar>
-        </w:tblPrEx>
         <w:tc>
           <w:tcPr>
             <w:tcW w:w="4819" w:type="dxa"/>
@@ -11483,12 +11270,6 @@
         </w:tc>
       </w:tr>
       <w:tr>
-        <w:tblPrEx>
-          <w:tblCellMar>
-            <w:top w:w="0" w:type="dxa"/>
-            <w:bottom w:w="0" w:type="dxa"/>
-          </w:tblCellMar>
-        </w:tblPrEx>
         <w:tc>
           <w:tcPr>
             <w:tcW w:w="4819" w:type="dxa"/>
@@ -11648,12 +11429,6 @@
         <w:gridCol w:w="8342"/>
       </w:tblGrid>
       <w:tr>
-        <w:tblPrEx>
-          <w:tblCellMar>
-            <w:top w:w="0" w:type="dxa"/>
-            <w:bottom w:w="0" w:type="dxa"/>
-          </w:tblCellMar>
-        </w:tblPrEx>
         <w:tc>
           <w:tcPr>
             <w:tcW w:w="900" w:type="dxa"/>
@@ -12127,6 +11902,90 @@
         </w:rPr>
         <w:t>.</w:t>
       </w:r>
+      <w:r>
+        <w:rPr>
+          <w:color w:val="000000"/>
+        </w:rPr>
+        <w:br/>
+      </w:r>
+      <w:r>
+        <w:rPr>
+          <w:color w:val="000000"/>
+        </w:rPr>
+        <w:br/>
+      </w:r>
+      <w:r>
+        <w:t>On les choisit parce que :</w:t>
+      </w:r>
+    </w:p>
+    <w:p>
+      <w:pPr>
+        <w:numPr>
+          <w:ilvl w:val="0"/>
+          <w:numId w:val="3"/>
+        </w:numPr>
+        <w:spacing w:before="80" w:after="80" w:line="320" w:lineRule="auto"/>
+      </w:pPr>
+      <w:r>
+        <w:t>L'</w:t>
+      </w:r>
+      <w:r>
+        <w:rPr>
+          <w:b/>
+          <w:bCs/>
+        </w:rPr>
+        <w:t>AUC-ROC</w:t>
+      </w:r>
+      <w:r>
+        <w:t xml:space="preserve"> prouve que ton modèle sait </w:t>
+      </w:r>
+      <w:r>
+        <w:rPr>
+          <w:b/>
+          <w:bCs/>
+        </w:rPr>
+        <w:t>distinguer</w:t>
+      </w:r>
+      <w:r>
+        <w:t xml:space="preserve"> un bon profil d'un mauvais profil.</w:t>
+      </w:r>
+    </w:p>
+    <w:p>
+      <w:pPr>
+        <w:numPr>
+          <w:ilvl w:val="0"/>
+          <w:numId w:val="3"/>
+        </w:numPr>
+        <w:spacing w:before="80" w:after="80" w:line="320" w:lineRule="auto"/>
+      </w:pPr>
+      <w:r>
+        <w:t xml:space="preserve">Le </w:t>
+      </w:r>
+      <w:r>
+        <w:rPr>
+          <w:b/>
+          <w:bCs/>
+        </w:rPr>
+        <w:t>F1-Score</w:t>
+      </w:r>
+      <w:r>
+        <w:t xml:space="preserve"> prouve que ton modèle prend des </w:t>
+      </w:r>
+      <w:r>
+        <w:rPr>
+          <w:b/>
+          <w:bCs/>
+        </w:rPr>
+        <w:t>décisions équilibrées</w:t>
+      </w:r>
+      <w:r>
+        <w:t xml:space="preserve"> sur le terrain.</w:t>
+      </w:r>
+    </w:p>
+    <w:p>
+      <w:pPr>
+        <w:spacing w:before="80" w:after="80" w:line="320" w:lineRule="auto"/>
+      </w:pPr>
     </w:p>
     <w:p>
       <w:r>
@@ -12290,12 +12149,6 @@
         <w:gridCol w:w="8264"/>
       </w:tblGrid>
       <w:tr>
-        <w:tblPrEx>
-          <w:tblCellMar>
-            <w:top w:w="0" w:type="dxa"/>
-            <w:bottom w:w="0" w:type="dxa"/>
-          </w:tblCellMar>
-        </w:tblPrEx>
         <w:tc>
           <w:tcPr>
             <w:tcW w:w="900" w:type="dxa"/>
@@ -12507,12 +12360,6 @@
         <w:gridCol w:w="8342"/>
       </w:tblGrid>
       <w:tr>
-        <w:tblPrEx>
-          <w:tblCellMar>
-            <w:top w:w="0" w:type="dxa"/>
-            <w:bottom w:w="0" w:type="dxa"/>
-          </w:tblCellMar>
-        </w:tblPrEx>
         <w:tc>
           <w:tcPr>
             <w:tcW w:w="900" w:type="dxa"/>
@@ -12926,12 +12773,6 @@
         <w:gridCol w:w="8342"/>
       </w:tblGrid>
       <w:tr>
-        <w:tblPrEx>
-          <w:tblCellMar>
-            <w:top w:w="0" w:type="dxa"/>
-            <w:bottom w:w="0" w:type="dxa"/>
-          </w:tblCellMar>
-        </w:tblPrEx>
         <w:tc>
           <w:tcPr>
             <w:tcW w:w="900" w:type="dxa"/>
@@ -13216,12 +13057,6 @@
         <w:gridCol w:w="2409"/>
       </w:tblGrid>
       <w:tr>
-        <w:tblPrEx>
-          <w:tblCellMar>
-            <w:top w:w="0" w:type="dxa"/>
-            <w:bottom w:w="0" w:type="dxa"/>
-          </w:tblCellMar>
-        </w:tblPrEx>
         <w:tc>
           <w:tcPr>
             <w:tcW w:w="1927" w:type="dxa"/>
@@ -13351,12 +13186,6 @@
         </w:tc>
       </w:tr>
       <w:tr>
-        <w:tblPrEx>
-          <w:tblCellMar>
-            <w:top w:w="0" w:type="dxa"/>
-            <w:bottom w:w="0" w:type="dxa"/>
-          </w:tblCellMar>
-        </w:tblPrEx>
         <w:tc>
           <w:tcPr>
             <w:tcW w:w="1927" w:type="dxa"/>
@@ -13507,12 +13336,6 @@
         </w:tc>
       </w:tr>
       <w:tr>
-        <w:tblPrEx>
-          <w:tblCellMar>
-            <w:top w:w="0" w:type="dxa"/>
-            <w:bottom w:w="0" w:type="dxa"/>
-          </w:tblCellMar>
-        </w:tblPrEx>
         <w:tc>
           <w:tcPr>
             <w:tcW w:w="1927" w:type="dxa"/>
@@ -13865,12 +13688,6 @@
         <w:gridCol w:w="2439"/>
       </w:tblGrid>
       <w:tr>
-        <w:tblPrEx>
-          <w:tblCellMar>
-            <w:top w:w="0" w:type="dxa"/>
-            <w:bottom w:w="0" w:type="dxa"/>
-          </w:tblCellMar>
-        </w:tblPrEx>
         <w:tc>
           <w:tcPr>
             <w:tcW w:w="2698" w:type="dxa"/>
@@ -14025,12 +13842,6 @@
         </w:tc>
       </w:tr>
       <w:tr>
-        <w:tblPrEx>
-          <w:tblCellMar>
-            <w:top w:w="0" w:type="dxa"/>
-            <w:bottom w:w="0" w:type="dxa"/>
-          </w:tblCellMar>
-        </w:tblPrEx>
         <w:tc>
           <w:tcPr>
             <w:tcW w:w="4819" w:type="dxa"/>
@@ -14153,12 +13964,6 @@
         </w:tc>
       </w:tr>
       <w:tr>
-        <w:tblPrEx>
-          <w:tblCellMar>
-            <w:top w:w="0" w:type="dxa"/>
-            <w:bottom w:w="0" w:type="dxa"/>
-          </w:tblCellMar>
-        </w:tblPrEx>
         <w:tc>
           <w:tcPr>
             <w:tcW w:w="4819" w:type="dxa"/>
@@ -14281,12 +14086,6 @@
         </w:tc>
       </w:tr>
       <w:tr>
-        <w:tblPrEx>
-          <w:tblCellMar>
-            <w:top w:w="0" w:type="dxa"/>
-            <w:bottom w:w="0" w:type="dxa"/>
-          </w:tblCellMar>
-        </w:tblPrEx>
         <w:tc>
           <w:tcPr>
             <w:tcW w:w="4819" w:type="dxa"/>
@@ -14419,12 +14218,6 @@
         </w:tc>
       </w:tr>
       <w:tr>
-        <w:tblPrEx>
-          <w:tblCellMar>
-            <w:top w:w="0" w:type="dxa"/>
-            <w:bottom w:w="0" w:type="dxa"/>
-          </w:tblCellMar>
-        </w:tblPrEx>
         <w:tc>
           <w:tcPr>
             <w:tcW w:w="4819" w:type="dxa"/>
@@ -14619,12 +14412,6 @@
         </w:tc>
       </w:tr>
       <w:tr>
-        <w:tblPrEx>
-          <w:tblCellMar>
-            <w:top w:w="0" w:type="dxa"/>
-            <w:bottom w:w="0" w:type="dxa"/>
-          </w:tblCellMar>
-        </w:tblPrEx>
         <w:tc>
           <w:tcPr>
             <w:tcW w:w="4819" w:type="dxa"/>
@@ -14898,12 +14685,6 @@
         <w:gridCol w:w="8342"/>
       </w:tblGrid>
       <w:tr>
-        <w:tblPrEx>
-          <w:tblCellMar>
-            <w:top w:w="0" w:type="dxa"/>
-            <w:bottom w:w="0" w:type="dxa"/>
-          </w:tblCellMar>
-        </w:tblPrEx>
         <w:tc>
           <w:tcPr>
             <w:tcW w:w="900" w:type="dxa"/>
@@ -15107,12 +14888,6 @@
         <w:gridCol w:w="3607"/>
       </w:tblGrid>
       <w:tr>
-        <w:tblPrEx>
-          <w:tblCellMar>
-            <w:top w:w="0" w:type="dxa"/>
-            <w:bottom w:w="0" w:type="dxa"/>
-          </w:tblCellMar>
-        </w:tblPrEx>
         <w:tc>
           <w:tcPr>
             <w:tcW w:w="1927" w:type="dxa"/>
@@ -15219,12 +14994,6 @@
         </w:tc>
       </w:tr>
       <w:tr>
-        <w:tblPrEx>
-          <w:tblCellMar>
-            <w:top w:w="0" w:type="dxa"/>
-            <w:bottom w:w="0" w:type="dxa"/>
-          </w:tblCellMar>
-        </w:tblPrEx>
         <w:tc>
           <w:tcPr>
             <w:tcW w:w="4819" w:type="dxa"/>
@@ -15316,12 +15085,6 @@
         </w:tc>
       </w:tr>
       <w:tr>
-        <w:tblPrEx>
-          <w:tblCellMar>
-            <w:top w:w="0" w:type="dxa"/>
-            <w:bottom w:w="0" w:type="dxa"/>
-          </w:tblCellMar>
-        </w:tblPrEx>
         <w:tc>
           <w:tcPr>
             <w:tcW w:w="4819" w:type="dxa"/>
@@ -15467,12 +15230,6 @@
         </w:tc>
       </w:tr>
       <w:tr>
-        <w:tblPrEx>
-          <w:tblCellMar>
-            <w:top w:w="0" w:type="dxa"/>
-            <w:bottom w:w="0" w:type="dxa"/>
-          </w:tblCellMar>
-        </w:tblPrEx>
         <w:tc>
           <w:tcPr>
             <w:tcW w:w="4819" w:type="dxa"/>
@@ -15638,12 +15395,6 @@
         </w:tc>
       </w:tr>
       <w:tr>
-        <w:tblPrEx>
-          <w:tblCellMar>
-            <w:top w:w="0" w:type="dxa"/>
-            <w:bottom w:w="0" w:type="dxa"/>
-          </w:tblCellMar>
-        </w:tblPrEx>
         <w:tc>
           <w:tcPr>
             <w:tcW w:w="4819" w:type="dxa"/>
@@ -15733,12 +15484,6 @@
         </w:tc>
       </w:tr>
       <w:tr>
-        <w:tblPrEx>
-          <w:tblCellMar>
-            <w:top w:w="0" w:type="dxa"/>
-            <w:bottom w:w="0" w:type="dxa"/>
-          </w:tblCellMar>
-        </w:tblPrEx>
         <w:tc>
           <w:tcPr>
             <w:tcW w:w="4819" w:type="dxa"/>
@@ -15963,12 +15708,6 @@
         <w:gridCol w:w="4139"/>
       </w:tblGrid>
       <w:tr>
-        <w:tblPrEx>
-          <w:tblCellMar>
-            <w:top w:w="0" w:type="dxa"/>
-            <w:bottom w:w="0" w:type="dxa"/>
-          </w:tblCellMar>
-        </w:tblPrEx>
         <w:tc>
           <w:tcPr>
             <w:tcW w:w="578" w:type="dxa"/>
@@ -16075,12 +15814,6 @@
         </w:tc>
       </w:tr>
       <w:tr>
-        <w:tblPrEx>
-          <w:tblCellMar>
-            <w:top w:w="0" w:type="dxa"/>
-            <w:bottom w:w="0" w:type="dxa"/>
-          </w:tblCellMar>
-        </w:tblPrEx>
         <w:tc>
           <w:tcPr>
             <w:tcW w:w="4819" w:type="dxa"/>
@@ -16191,12 +15924,6 @@
         </w:tc>
       </w:tr>
       <w:tr>
-        <w:tblPrEx>
-          <w:tblCellMar>
-            <w:top w:w="0" w:type="dxa"/>
-            <w:bottom w:w="0" w:type="dxa"/>
-          </w:tblCellMar>
-        </w:tblPrEx>
         <w:tc>
           <w:tcPr>
             <w:tcW w:w="4819" w:type="dxa"/>
@@ -16353,12 +16080,6 @@
         </w:tc>
       </w:tr>
       <w:tr>
-        <w:tblPrEx>
-          <w:tblCellMar>
-            <w:top w:w="0" w:type="dxa"/>
-            <w:bottom w:w="0" w:type="dxa"/>
-          </w:tblCellMar>
-        </w:tblPrEx>
         <w:tc>
           <w:tcPr>
             <w:tcW w:w="4819" w:type="dxa"/>
@@ -16497,12 +16218,6 @@
         </w:tc>
       </w:tr>
       <w:tr>
-        <w:tblPrEx>
-          <w:tblCellMar>
-            <w:top w:w="0" w:type="dxa"/>
-            <w:bottom w:w="0" w:type="dxa"/>
-          </w:tblCellMar>
-        </w:tblPrEx>
         <w:tc>
           <w:tcPr>
             <w:tcW w:w="4819" w:type="dxa"/>
@@ -16651,12 +16366,6 @@
         </w:tc>
       </w:tr>
       <w:tr>
-        <w:tblPrEx>
-          <w:tblCellMar>
-            <w:top w:w="0" w:type="dxa"/>
-            <w:bottom w:w="0" w:type="dxa"/>
-          </w:tblCellMar>
-        </w:tblPrEx>
         <w:tc>
           <w:tcPr>
             <w:tcW w:w="4819" w:type="dxa"/>
@@ -16842,12 +16551,6 @@
         <w:gridCol w:w="3828"/>
       </w:tblGrid>
       <w:tr>
-        <w:tblPrEx>
-          <w:tblCellMar>
-            <w:top w:w="0" w:type="dxa"/>
-            <w:bottom w:w="0" w:type="dxa"/>
-          </w:tblCellMar>
-        </w:tblPrEx>
         <w:tc>
           <w:tcPr>
             <w:tcW w:w="1156" w:type="dxa"/>
@@ -16954,12 +16657,6 @@
         </w:tc>
       </w:tr>
       <w:tr>
-        <w:tblPrEx>
-          <w:tblCellMar>
-            <w:top w:w="0" w:type="dxa"/>
-            <w:bottom w:w="0" w:type="dxa"/>
-          </w:tblCellMar>
-        </w:tblPrEx>
         <w:tc>
           <w:tcPr>
             <w:tcW w:w="4819" w:type="dxa"/>
@@ -17071,12 +16768,6 @@
         </w:tc>
       </w:tr>
       <w:tr>
-        <w:tblPrEx>
-          <w:tblCellMar>
-            <w:top w:w="0" w:type="dxa"/>
-            <w:bottom w:w="0" w:type="dxa"/>
-          </w:tblCellMar>
-        </w:tblPrEx>
         <w:tc>
           <w:tcPr>
             <w:tcW w:w="4819" w:type="dxa"/>
@@ -17204,12 +16895,6 @@
         </w:tc>
       </w:tr>
       <w:tr>
-        <w:tblPrEx>
-          <w:tblCellMar>
-            <w:top w:w="0" w:type="dxa"/>
-            <w:bottom w:w="0" w:type="dxa"/>
-          </w:tblCellMar>
-        </w:tblPrEx>
         <w:tc>
           <w:tcPr>
             <w:tcW w:w="4819" w:type="dxa"/>
@@ -17329,12 +17014,6 @@
         </w:tc>
       </w:tr>
       <w:tr>
-        <w:tblPrEx>
-          <w:tblCellMar>
-            <w:top w:w="0" w:type="dxa"/>
-            <w:bottom w:w="0" w:type="dxa"/>
-          </w:tblCellMar>
-        </w:tblPrEx>
         <w:tc>
           <w:tcPr>
             <w:tcW w:w="4819" w:type="dxa"/>
@@ -17474,12 +17153,6 @@
         <w:gridCol w:w="8342"/>
       </w:tblGrid>
       <w:tr>
-        <w:tblPrEx>
-          <w:tblCellMar>
-            <w:top w:w="0" w:type="dxa"/>
-            <w:bottom w:w="0" w:type="dxa"/>
-          </w:tblCellMar>
-        </w:tblPrEx>
         <w:tc>
           <w:tcPr>
             <w:tcW w:w="900" w:type="dxa"/>
@@ -17675,7 +17348,6 @@
         </w:rPr>
         <w:t xml:space="preserve"> </w:t>
       </w:r>
-      <w:proofErr w:type="spellStart"/>
       <w:proofErr w:type="gramStart"/>
       <w:r>
         <w:rPr>
@@ -17683,7 +17355,6 @@
         </w:rPr>
         <w:t>a</w:t>
       </w:r>
-      <w:proofErr w:type="spellEnd"/>
       <w:proofErr w:type="gramEnd"/>
       <w:r>
         <w:rPr>
@@ -17994,24 +17665,27 @@
       <w:pPr>
         <w:spacing w:before="80" w:after="80" w:line="320" w:lineRule="auto"/>
         <w:ind w:left="360"/>
+        <w:rPr>
+          <w:lang w:val="en-US"/>
+        </w:rPr>
       </w:pPr>
       <w:proofErr w:type="spellStart"/>
-      <w:proofErr w:type="gramStart"/>
       <w:r>
         <w:rPr>
           <w:b/>
           <w:bCs/>
           <w:color w:val="000000"/>
+          <w:lang w:val="en-US"/>
         </w:rPr>
         <w:t>mlflow</w:t>
       </w:r>
       <w:proofErr w:type="spellEnd"/>
-      <w:proofErr w:type="gramEnd"/>
       <w:r>
         <w:rPr>
           <w:b/>
           <w:bCs/>
           <w:color w:val="000000"/>
+          <w:lang w:val="en-US"/>
         </w:rPr>
         <w:t xml:space="preserve"> </w:t>
       </w:r>
@@ -18021,6 +17695,7 @@
           <w:b/>
           <w:bCs/>
           <w:color w:val="000000"/>
+          <w:lang w:val="en-US"/>
         </w:rPr>
         <w:t>ui</w:t>
       </w:r>
@@ -18030,6 +17705,7 @@
           <w:b/>
           <w:bCs/>
           <w:color w:val="000000"/>
+          <w:lang w:val="en-US"/>
         </w:rPr>
         <w:t xml:space="preserve"> --backend-store-</w:t>
       </w:r>
@@ -18039,6 +17715,7 @@
           <w:b/>
           <w:bCs/>
           <w:color w:val="000000"/>
+          <w:lang w:val="en-US"/>
         </w:rPr>
         <w:t>uri</w:t>
       </w:r>
@@ -18048,6 +17725,7 @@
           <w:b/>
           <w:bCs/>
           <w:color w:val="000000"/>
+          <w:lang w:val="en-US"/>
         </w:rPr>
         <w:t xml:space="preserve"> sqlite:///mlruns/mlflow.db</w:t>
       </w:r>
@@ -18084,12 +17762,6 @@
         <w:gridCol w:w="8342"/>
       </w:tblGrid>
       <w:tr>
-        <w:tblPrEx>
-          <w:tblCellMar>
-            <w:top w:w="0" w:type="dxa"/>
-            <w:bottom w:w="0" w:type="dxa"/>
-          </w:tblCellMar>
-        </w:tblPrEx>
         <w:tc>
           <w:tcPr>
             <w:tcW w:w="900" w:type="dxa"/>
@@ -18554,12 +18226,6 @@
         <w:gridCol w:w="2659"/>
       </w:tblGrid>
       <w:tr>
-        <w:tblPrEx>
-          <w:tblCellMar>
-            <w:top w:w="0" w:type="dxa"/>
-            <w:bottom w:w="0" w:type="dxa"/>
-          </w:tblCellMar>
-        </w:tblPrEx>
         <w:tc>
           <w:tcPr>
             <w:tcW w:w="1734" w:type="dxa"/>
@@ -18702,12 +18368,6 @@
         </w:tc>
       </w:tr>
       <w:tr>
-        <w:tblPrEx>
-          <w:tblCellMar>
-            <w:top w:w="0" w:type="dxa"/>
-            <w:bottom w:w="0" w:type="dxa"/>
-          </w:tblCellMar>
-        </w:tblPrEx>
         <w:tc>
           <w:tcPr>
             <w:tcW w:w="4819" w:type="dxa"/>
@@ -18843,12 +18503,6 @@
         </w:tc>
       </w:tr>
       <w:tr>
-        <w:tblPrEx>
-          <w:tblCellMar>
-            <w:top w:w="0" w:type="dxa"/>
-            <w:bottom w:w="0" w:type="dxa"/>
-          </w:tblCellMar>
-        </w:tblPrEx>
         <w:tc>
           <w:tcPr>
             <w:tcW w:w="4819" w:type="dxa"/>
@@ -19010,12 +18664,6 @@
         </w:tc>
       </w:tr>
       <w:tr>
-        <w:tblPrEx>
-          <w:tblCellMar>
-            <w:top w:w="0" w:type="dxa"/>
-            <w:bottom w:w="0" w:type="dxa"/>
-          </w:tblCellMar>
-        </w:tblPrEx>
         <w:tc>
           <w:tcPr>
             <w:tcW w:w="4819" w:type="dxa"/>
@@ -19151,12 +18799,6 @@
         </w:tc>
       </w:tr>
       <w:tr>
-        <w:tblPrEx>
-          <w:tblCellMar>
-            <w:top w:w="0" w:type="dxa"/>
-            <w:bottom w:w="0" w:type="dxa"/>
-          </w:tblCellMar>
-        </w:tblPrEx>
         <w:tc>
           <w:tcPr>
             <w:tcW w:w="4819" w:type="dxa"/>
@@ -19444,12 +19086,6 @@
         <w:gridCol w:w="8409"/>
       </w:tblGrid>
       <w:tr>
-        <w:tblPrEx>
-          <w:tblCellMar>
-            <w:top w:w="0" w:type="dxa"/>
-            <w:bottom w:w="0" w:type="dxa"/>
-          </w:tblCellMar>
-        </w:tblPrEx>
         <w:tc>
           <w:tcPr>
             <w:tcW w:w="900" w:type="dxa"/>
@@ -19885,12 +19521,6 @@
         <w:gridCol w:w="2543"/>
       </w:tblGrid>
       <w:tr>
-        <w:tblPrEx>
-          <w:tblCellMar>
-            <w:top w:w="0" w:type="dxa"/>
-            <w:bottom w:w="0" w:type="dxa"/>
-          </w:tblCellMar>
-        </w:tblPrEx>
         <w:tc>
           <w:tcPr>
             <w:tcW w:w="578" w:type="dxa"/>
@@ -20031,12 +19661,6 @@
         </w:tc>
       </w:tr>
       <w:tr>
-        <w:tblPrEx>
-          <w:tblCellMar>
-            <w:top w:w="0" w:type="dxa"/>
-            <w:bottom w:w="0" w:type="dxa"/>
-          </w:tblCellMar>
-        </w:tblPrEx>
         <w:tc>
           <w:tcPr>
             <w:tcW w:w="4819" w:type="dxa"/>
@@ -20188,12 +19812,6 @@
         </w:tc>
       </w:tr>
       <w:tr>
-        <w:tblPrEx>
-          <w:tblCellMar>
-            <w:top w:w="0" w:type="dxa"/>
-            <w:bottom w:w="0" w:type="dxa"/>
-          </w:tblCellMar>
-        </w:tblPrEx>
         <w:tc>
           <w:tcPr>
             <w:tcW w:w="4819" w:type="dxa"/>
@@ -20397,12 +20015,6 @@
         </w:tc>
       </w:tr>
       <w:tr>
-        <w:tblPrEx>
-          <w:tblCellMar>
-            <w:top w:w="0" w:type="dxa"/>
-            <w:bottom w:w="0" w:type="dxa"/>
-          </w:tblCellMar>
-        </w:tblPrEx>
         <w:tc>
           <w:tcPr>
             <w:tcW w:w="4819" w:type="dxa"/>
@@ -20571,12 +20183,6 @@
         </w:tc>
       </w:tr>
       <w:tr>
-        <w:tblPrEx>
-          <w:tblCellMar>
-            <w:top w:w="0" w:type="dxa"/>
-            <w:bottom w:w="0" w:type="dxa"/>
-          </w:tblCellMar>
-        </w:tblPrEx>
         <w:tc>
           <w:tcPr>
             <w:tcW w:w="4819" w:type="dxa"/>
@@ -20730,12 +20336,6 @@
         </w:tc>
       </w:tr>
       <w:tr>
-        <w:tblPrEx>
-          <w:tblCellMar>
-            <w:top w:w="0" w:type="dxa"/>
-            <w:bottom w:w="0" w:type="dxa"/>
-          </w:tblCellMar>
-        </w:tblPrEx>
         <w:tc>
           <w:tcPr>
             <w:tcW w:w="4819" w:type="dxa"/>
@@ -20877,12 +20477,6 @@
         </w:tc>
       </w:tr>
       <w:tr>
-        <w:tblPrEx>
-          <w:tblCellMar>
-            <w:top w:w="0" w:type="dxa"/>
-            <w:bottom w:w="0" w:type="dxa"/>
-          </w:tblCellMar>
-        </w:tblPrEx>
         <w:tc>
           <w:tcPr>
             <w:tcW w:w="4819" w:type="dxa"/>
@@ -21447,12 +21041,6 @@
         <w:gridCol w:w="2410"/>
       </w:tblGrid>
       <w:tr>
-        <w:tblPrEx>
-          <w:tblCellMar>
-            <w:top w:w="0" w:type="dxa"/>
-            <w:bottom w:w="0" w:type="dxa"/>
-          </w:tblCellMar>
-        </w:tblPrEx>
         <w:tc>
           <w:tcPr>
             <w:tcW w:w="2409" w:type="dxa"/>
@@ -21983,7 +21571,27 @@
         <w:szCs w:val="18"/>
         <w:lang w:val="en-US"/>
       </w:rPr>
-      <w:t>EY Advisory — Modele PD Retail   |   Credit Risk Modeling</w:t>
+      <w:t xml:space="preserve">EY — </w:t>
+    </w:r>
+    <w:proofErr w:type="spellStart"/>
+    <w:r>
+      <w:rPr>
+        <w:color w:val="64748B"/>
+        <w:sz w:val="18"/>
+        <w:szCs w:val="18"/>
+        <w:lang w:val="en-US"/>
+      </w:rPr>
+      <w:t>Modele</w:t>
+    </w:r>
+    <w:proofErr w:type="spellEnd"/>
+    <w:r>
+      <w:rPr>
+        <w:color w:val="64748B"/>
+        <w:sz w:val="18"/>
+        <w:szCs w:val="18"/>
+        <w:lang w:val="en-US"/>
+      </w:rPr>
+      <w:t xml:space="preserve"> PD Retail   |   Credit Risk Modeling</w:t>
     </w:r>
   </w:p>
 </w:hdr>
@@ -22135,6 +21743,155 @@
       <w:lvlJc w:val="left"/>
     </w:lvl>
   </w:abstractNum>
+  <w:abstractNum w:abstractNumId="2" w15:restartNumberingAfterBreak="0">
+    <w:nsid w:val="4775171B"/>
+    <w:multiLevelType w:val="multilevel"/>
+    <w:tmpl w:val="5A68BF80"/>
+    <w:lvl w:ilvl="0">
+      <w:start w:val="1"/>
+      <w:numFmt w:val="bullet"/>
+      <w:lvlText w:val=""/>
+      <w:lvlJc w:val="left"/>
+      <w:pPr>
+        <w:tabs>
+          <w:tab w:val="num" w:pos="720"/>
+        </w:tabs>
+        <w:ind w:left="720" w:hanging="360"/>
+      </w:pPr>
+      <w:rPr>
+        <w:rFonts w:ascii="Symbol" w:hAnsi="Symbol" w:hint="default"/>
+        <w:sz w:val="20"/>
+      </w:rPr>
+    </w:lvl>
+    <w:lvl w:ilvl="1" w:tentative="1">
+      <w:start w:val="1"/>
+      <w:numFmt w:val="bullet"/>
+      <w:lvlText w:val="o"/>
+      <w:lvlJc w:val="left"/>
+      <w:pPr>
+        <w:tabs>
+          <w:tab w:val="num" w:pos="1440"/>
+        </w:tabs>
+        <w:ind w:left="1440" w:hanging="360"/>
+      </w:pPr>
+      <w:rPr>
+        <w:rFonts w:ascii="Courier New" w:hAnsi="Courier New" w:hint="default"/>
+        <w:sz w:val="20"/>
+      </w:rPr>
+    </w:lvl>
+    <w:lvl w:ilvl="2" w:tentative="1">
+      <w:start w:val="1"/>
+      <w:numFmt w:val="bullet"/>
+      <w:lvlText w:val=""/>
+      <w:lvlJc w:val="left"/>
+      <w:pPr>
+        <w:tabs>
+          <w:tab w:val="num" w:pos="2160"/>
+        </w:tabs>
+        <w:ind w:left="2160" w:hanging="360"/>
+      </w:pPr>
+      <w:rPr>
+        <w:rFonts w:ascii="Wingdings" w:hAnsi="Wingdings" w:hint="default"/>
+        <w:sz w:val="20"/>
+      </w:rPr>
+    </w:lvl>
+    <w:lvl w:ilvl="3" w:tentative="1">
+      <w:start w:val="1"/>
+      <w:numFmt w:val="bullet"/>
+      <w:lvlText w:val=""/>
+      <w:lvlJc w:val="left"/>
+      <w:pPr>
+        <w:tabs>
+          <w:tab w:val="num" w:pos="2880"/>
+        </w:tabs>
+        <w:ind w:left="2880" w:hanging="360"/>
+      </w:pPr>
+      <w:rPr>
+        <w:rFonts w:ascii="Wingdings" w:hAnsi="Wingdings" w:hint="default"/>
+        <w:sz w:val="20"/>
+      </w:rPr>
+    </w:lvl>
+    <w:lvl w:ilvl="4" w:tentative="1">
+      <w:start w:val="1"/>
+      <w:numFmt w:val="bullet"/>
+      <w:lvlText w:val=""/>
+      <w:lvlJc w:val="left"/>
+      <w:pPr>
+        <w:tabs>
+          <w:tab w:val="num" w:pos="3600"/>
+        </w:tabs>
+        <w:ind w:left="3600" w:hanging="360"/>
+      </w:pPr>
+      <w:rPr>
+        <w:rFonts w:ascii="Wingdings" w:hAnsi="Wingdings" w:hint="default"/>
+        <w:sz w:val="20"/>
+      </w:rPr>
+    </w:lvl>
+    <w:lvl w:ilvl="5" w:tentative="1">
+      <w:start w:val="1"/>
+      <w:numFmt w:val="bullet"/>
+      <w:lvlText w:val=""/>
+      <w:lvlJc w:val="left"/>
+      <w:pPr>
+        <w:tabs>
+          <w:tab w:val="num" w:pos="4320"/>
+        </w:tabs>
+        <w:ind w:left="4320" w:hanging="360"/>
+      </w:pPr>
+      <w:rPr>
+        <w:rFonts w:ascii="Wingdings" w:hAnsi="Wingdings" w:hint="default"/>
+        <w:sz w:val="20"/>
+      </w:rPr>
+    </w:lvl>
+    <w:lvl w:ilvl="6" w:tentative="1">
+      <w:start w:val="1"/>
+      <w:numFmt w:val="bullet"/>
+      <w:lvlText w:val=""/>
+      <w:lvlJc w:val="left"/>
+      <w:pPr>
+        <w:tabs>
+          <w:tab w:val="num" w:pos="5040"/>
+        </w:tabs>
+        <w:ind w:left="5040" w:hanging="360"/>
+      </w:pPr>
+      <w:rPr>
+        <w:rFonts w:ascii="Wingdings" w:hAnsi="Wingdings" w:hint="default"/>
+        <w:sz w:val="20"/>
+      </w:rPr>
+    </w:lvl>
+    <w:lvl w:ilvl="7" w:tentative="1">
+      <w:start w:val="1"/>
+      <w:numFmt w:val="bullet"/>
+      <w:lvlText w:val=""/>
+      <w:lvlJc w:val="left"/>
+      <w:pPr>
+        <w:tabs>
+          <w:tab w:val="num" w:pos="5760"/>
+        </w:tabs>
+        <w:ind w:left="5760" w:hanging="360"/>
+      </w:pPr>
+      <w:rPr>
+        <w:rFonts w:ascii="Wingdings" w:hAnsi="Wingdings" w:hint="default"/>
+        <w:sz w:val="20"/>
+      </w:rPr>
+    </w:lvl>
+    <w:lvl w:ilvl="8" w:tentative="1">
+      <w:start w:val="1"/>
+      <w:numFmt w:val="bullet"/>
+      <w:lvlText w:val=""/>
+      <w:lvlJc w:val="left"/>
+      <w:pPr>
+        <w:tabs>
+          <w:tab w:val="num" w:pos="6480"/>
+        </w:tabs>
+        <w:ind w:left="6480" w:hanging="360"/>
+      </w:pPr>
+      <w:rPr>
+        <w:rFonts w:ascii="Wingdings" w:hAnsi="Wingdings" w:hint="default"/>
+        <w:sz w:val="20"/>
+      </w:rPr>
+    </w:lvl>
+  </w:abstractNum>
   <w:num w:numId="1" w16cid:durableId="631834115">
     <w:abstractNumId w:val="0"/>
     <w:lvlOverride w:ilvl="0">
@@ -22146,6 +21903,9 @@
     <w:lvlOverride w:ilvl="0">
       <w:startOverride w:val="1"/>
     </w:lvlOverride>
+  </w:num>
+  <w:num w:numId="3" w16cid:durableId="85276493">
+    <w:abstractNumId w:val="2"/>
   </w:num>
 </w:numbering>
 </file>
@@ -22639,7 +22399,6 @@
   <w:style w:type="character" w:default="1" w:styleId="Policepardfaut">
     <w:name w:val="Default Paragraph Font"/>
     <w:uiPriority w:val="1"/>
-    <w:semiHidden/>
     <w:unhideWhenUsed/>
   </w:style>
   <w:style w:type="table" w:default="1" w:styleId="TableauNormal">
@@ -22779,6 +22538,48 @@
       <w:spacing w:after="100"/>
       <w:ind w:left="220"/>
     </w:pPr>
+  </w:style>
+  <w:style w:type="paragraph" w:styleId="En-tte">
+    <w:name w:val="header"/>
+    <w:basedOn w:val="Normal"/>
+    <w:link w:val="En-tteCar"/>
+    <w:uiPriority w:val="99"/>
+    <w:unhideWhenUsed/>
+    <w:rsid w:val="000D15A4"/>
+    <w:pPr>
+      <w:tabs>
+        <w:tab w:val="center" w:pos="4536"/>
+        <w:tab w:val="right" w:pos="9072"/>
+      </w:tabs>
+    </w:pPr>
+  </w:style>
+  <w:style w:type="character" w:customStyle="1" w:styleId="En-tteCar">
+    <w:name w:val="En-tête Car"/>
+    <w:basedOn w:val="Policepardfaut"/>
+    <w:link w:val="En-tte"/>
+    <w:uiPriority w:val="99"/>
+    <w:rsid w:val="000D15A4"/>
+  </w:style>
+  <w:style w:type="paragraph" w:styleId="Pieddepage">
+    <w:name w:val="footer"/>
+    <w:basedOn w:val="Normal"/>
+    <w:link w:val="PieddepageCar"/>
+    <w:uiPriority w:val="99"/>
+    <w:unhideWhenUsed/>
+    <w:rsid w:val="000D15A4"/>
+    <w:pPr>
+      <w:tabs>
+        <w:tab w:val="center" w:pos="4536"/>
+        <w:tab w:val="right" w:pos="9072"/>
+      </w:tabs>
+    </w:pPr>
+  </w:style>
+  <w:style w:type="character" w:customStyle="1" w:styleId="PieddepageCar">
+    <w:name w:val="Pied de page Car"/>
+    <w:basedOn w:val="Policepardfaut"/>
+    <w:link w:val="Pieddepage"/>
+    <w:uiPriority w:val="99"/>
+    <w:rsid w:val="000D15A4"/>
   </w:style>
 </w:styles>
 </file>

</xml_diff>